<commit_message>
Added Splash Screen, User can book the tickets by wallet, Real Time Updates of Booked Ticket
</commit_message>
<xml_diff>
--- a/Challenges via making app.docx
+++ b/Challenges via making app.docx
@@ -42,7 +42,21 @@
         <w:rPr>
           <w:lang w:val="en-GB"/>
         </w:rPr>
-        <w:t>Design Issue either to pass token from each function or to pass it as a interceptor, so passed it via each function call by retrieving from token manager local db.</w:t>
+        <w:t xml:space="preserve">Design Issue either to pass token from each function or to pass it as </w:t>
+      </w:r>
+      <w:proofErr w:type="gramStart"/>
+      <w:r>
+        <w:rPr>
+          <w:lang w:val="en-GB"/>
+        </w:rPr>
+        <w:t>a</w:t>
+      </w:r>
+      <w:proofErr w:type="gramEnd"/>
+      <w:r>
+        <w:rPr>
+          <w:lang w:val="en-GB"/>
+        </w:rPr>
+        <w:t xml:space="preserve"> interceptor, so passed it via each function call by retrieving from token manager local db.</w:t>
       </w:r>
     </w:p>
     <w:p>
@@ -55,9 +69,75 @@
     </w:p>
     <w:p>
       <w:r>
-        <w:t>JSON auto converts isAvailable to available as a key (Seat collection)</w:t>
+        <w:t xml:space="preserve">JSON auto converts </w:t>
+      </w:r>
+      <w:proofErr w:type="spellStart"/>
+      <w:r>
+        <w:t>isAvailable</w:t>
+      </w:r>
+      <w:proofErr w:type="spellEnd"/>
+      <w:r>
+        <w:t xml:space="preserve"> to available as a key (Seat collection)</w:t>
       </w:r>
     </w:p>
+    <w:p>
+      <w:r>
+        <w:t>Make sure backend is properly deployed</w:t>
+      </w:r>
+    </w:p>
+    <w:p>
+      <w:r>
+        <w:t>Make sure hitting format is correct</w:t>
+      </w:r>
+    </w:p>
+    <w:p>
+      <w:r>
+        <w:t>Make sure test cases defined in test folder also correct and no bug in them</w:t>
+      </w:r>
+    </w:p>
+    <w:p>
+      <w:r>
+        <w:t>Faced issue in serializing and deserializing the list of seats (</w:t>
+      </w:r>
+      <w:proofErr w:type="gramStart"/>
+      <w:r>
+        <w:t>string ,</w:t>
+      </w:r>
+      <w:proofErr w:type="gramEnd"/>
+      <w:r>
+        <w:t xml:space="preserve"> list)</w:t>
+      </w:r>
+    </w:p>
+    <w:p>
+      <w:pPr>
+        <w:rPr>
+          <w:lang w:val="en-PK"/>
+        </w:rPr>
+      </w:pPr>
+      <w:proofErr w:type="spellStart"/>
+      <w:proofErr w:type="gramStart"/>
+      <w:r>
+        <w:rPr>
+          <w:lang w:val="en-PK"/>
+        </w:rPr>
+        <w:t>io.jsonwebtoken</w:t>
+      </w:r>
+      <w:proofErr w:type="gramEnd"/>
+      <w:r>
+        <w:rPr>
+          <w:lang w:val="en-PK"/>
+        </w:rPr>
+        <w:t>.security.SignatureException</w:t>
+      </w:r>
+      <w:proofErr w:type="spellEnd"/>
+      <w:r>
+        <w:rPr>
+          <w:lang w:val="en-PK"/>
+        </w:rPr>
+        <w:t>: JWT signature does not match locally computed signature. JWT validity cannot be asserted and should not be trusted.</w:t>
+      </w:r>
+    </w:p>
+    <w:p/>
     <w:sectPr>
       <w:pgSz w:w="11906" w:h="16838"/>
       <w:pgMar w:top="1440" w:right="1440" w:bottom="1440" w:left="1440" w:header="708" w:footer="708" w:gutter="0"/>
@@ -901,7 +981,6 @@
   <w:style w:type="character" w:default="1" w:styleId="DefaultParagraphFont">
     <w:name w:val="Default Paragraph Font"/>
     <w:uiPriority w:val="1"/>
-    <w:semiHidden/>
     <w:unhideWhenUsed/>
   </w:style>
   <w:style w:type="table" w:default="1" w:styleId="TableNormal">

</xml_diff>

<commit_message>
Tickets Book Screen, User can Book Ticket, Real time updates
</commit_message>
<xml_diff>
--- a/Challenges via making app.docx
+++ b/Challenges via making app.docx
@@ -137,7 +137,26 @@
         <w:t>: JWT signature does not match locally computed signature. JWT validity cannot be asserted and should not be trusted.</w:t>
       </w:r>
     </w:p>
-    <w:p/>
+    <w:p>
+      <w:r>
+        <w:t xml:space="preserve">Why we use interface in retrofit </w:t>
+      </w:r>
+      <w:proofErr w:type="spellStart"/>
+      <w:proofErr w:type="gramStart"/>
+      <w:r>
+        <w:t>service?</w:t>
+      </w:r>
+      <w:r>
+        <w:t>s</w:t>
+      </w:r>
+      <w:proofErr w:type="spellEnd"/>
+      <w:proofErr w:type="gramEnd"/>
+    </w:p>
+    <w:p>
+      <w:r>
+        <w:t>Handling crash when no trending events data is there</w:t>
+      </w:r>
+    </w:p>
     <w:sectPr>
       <w:pgSz w:w="11906" w:h="16838"/>
       <w:pgMar w:top="1440" w:right="1440" w:bottom="1440" w:left="1440" w:header="708" w:footer="708" w:gutter="0"/>
@@ -981,6 +1000,7 @@
   <w:style w:type="character" w:default="1" w:styleId="DefaultParagraphFont">
     <w:name w:val="Default Paragraph Font"/>
     <w:uiPriority w:val="1"/>
+    <w:semiHidden/>
     <w:unhideWhenUsed/>
   </w:style>
   <w:style w:type="table" w:default="1" w:styleId="TableNormal">

</xml_diff>

<commit_message>
Image Slider Fixed and Images Compressed
</commit_message>
<xml_diff>
--- a/Challenges via making app.docx
+++ b/Challenges via making app.docx
@@ -42,21 +42,7 @@
         <w:rPr>
           <w:lang w:val="en-GB"/>
         </w:rPr>
-        <w:t xml:space="preserve">Design Issue either to pass token from each function or to pass it as </w:t>
-      </w:r>
-      <w:proofErr w:type="gramStart"/>
-      <w:r>
-        <w:rPr>
-          <w:lang w:val="en-GB"/>
-        </w:rPr>
-        <w:t>a</w:t>
-      </w:r>
-      <w:proofErr w:type="gramEnd"/>
-      <w:r>
-        <w:rPr>
-          <w:lang w:val="en-GB"/>
-        </w:rPr>
-        <w:t xml:space="preserve"> interceptor, so passed it via each function call by retrieving from token manager local db.</w:t>
+        <w:t>Design Issue either to pass token from each function or to pass it as a interceptor, so passed it via each function call by retrieving from token manager local db.</w:t>
       </w:r>
     </w:p>
     <w:p>
@@ -69,15 +55,7 @@
     </w:p>
     <w:p>
       <w:r>
-        <w:t xml:space="preserve">JSON auto converts </w:t>
-      </w:r>
-      <w:proofErr w:type="spellStart"/>
-      <w:r>
-        <w:t>isAvailable</w:t>
-      </w:r>
-      <w:proofErr w:type="spellEnd"/>
-      <w:r>
-        <w:t xml:space="preserve"> to available as a key (Seat collection)</w:t>
+        <w:t>JSON auto converts isAvailable to available as a key (Seat collection)</w:t>
       </w:r>
     </w:p>
     <w:p>
@@ -97,15 +75,7 @@
     </w:p>
     <w:p>
       <w:r>
-        <w:t>Faced issue in serializing and deserializing the list of seats (</w:t>
-      </w:r>
-      <w:proofErr w:type="gramStart"/>
-      <w:r>
-        <w:t>string ,</w:t>
-      </w:r>
-      <w:proofErr w:type="gramEnd"/>
-      <w:r>
-        <w:t xml:space="preserve"> list)</w:t>
+        <w:t>Faced issue in serializing and deserializing the list of seats (string , list)</w:t>
       </w:r>
     </w:p>
     <w:p>
@@ -114,47 +84,26 @@
           <w:lang w:val="en-PK"/>
         </w:rPr>
       </w:pPr>
-      <w:proofErr w:type="spellStart"/>
-      <w:proofErr w:type="gramStart"/>
       <w:r>
         <w:rPr>
           <w:lang w:val="en-PK"/>
         </w:rPr>
-        <w:t>io.jsonwebtoken</w:t>
-      </w:r>
-      <w:proofErr w:type="gramEnd"/>
-      <w:r>
-        <w:rPr>
-          <w:lang w:val="en-PK"/>
-        </w:rPr>
-        <w:t>.security.SignatureException</w:t>
-      </w:r>
-      <w:proofErr w:type="spellEnd"/>
-      <w:r>
-        <w:rPr>
-          <w:lang w:val="en-PK"/>
-        </w:rPr>
-        <w:t>: JWT signature does not match locally computed signature. JWT validity cannot be asserted and should not be trusted.</w:t>
+        <w:t>io.jsonwebtoken.security.SignatureException: JWT signature does not match locally computed signature. JWT validity cannot be asserted and should not be trusted.</w:t>
       </w:r>
     </w:p>
     <w:p>
       <w:r>
-        <w:t xml:space="preserve">Why we use interface in retrofit </w:t>
+        <w:t>Why we use interface in retrofit service?</w:t>
       </w:r>
-      <w:proofErr w:type="spellStart"/>
-      <w:proofErr w:type="gramStart"/>
-      <w:r>
-        <w:t>service?</w:t>
-      </w:r>
-      <w:r>
-        <w:t>s</w:t>
-      </w:r>
-      <w:proofErr w:type="spellEnd"/>
-      <w:proofErr w:type="gramEnd"/>
     </w:p>
     <w:p>
       <w:r>
         <w:t>Handling crash when no trending events data is there</w:t>
+      </w:r>
+    </w:p>
+    <w:p>
+      <w:r>
+        <w:t>Faced Issue in handling images size for displaying in slider</w:t>
       </w:r>
     </w:p>
     <w:sectPr>

</xml_diff>

<commit_message>
User can update currency, Optimized Resources,  Added Animations for recyclerview, Improved caraousel effect
</commit_message>
<xml_diff>
--- a/Challenges via making app.docx
+++ b/Challenges via making app.docx
@@ -104,6 +104,35 @@
     <w:p>
       <w:r>
         <w:t>Faced Issue in handling images size for displaying in slider</w:t>
+      </w:r>
+    </w:p>
+    <w:p>
+      <w:pPr>
+        <w:rPr>
+          <w:lang w:val="en-PK"/>
+        </w:rPr>
+      </w:pPr>
+      <w:r>
+        <w:t>Improved APK size</w:t>
+      </w:r>
+      <w:r>
+        <w:t xml:space="preserve"> -&gt; </w:t>
+      </w:r>
+      <w:r>
+        <w:rPr>
+          <w:lang w:val="en-PK"/>
+        </w:rPr>
+        <w:t>isShrinkResources = true</w:t>
+      </w:r>
+    </w:p>
+    <w:p>
+      <w:r>
+        <w:t>And minify enabled</w:t>
+      </w:r>
+    </w:p>
+    <w:p>
+      <w:r>
+        <w:t>Extraneous code issues in XML</w:t>
       </w:r>
     </w:p>
     <w:sectPr>
@@ -949,7 +978,6 @@
   <w:style w:type="character" w:default="1" w:styleId="DefaultParagraphFont">
     <w:name w:val="Default Paragraph Font"/>
     <w:uiPriority w:val="1"/>
-    <w:semiHidden/>
     <w:unhideWhenUsed/>
   </w:style>
   <w:style w:type="table" w:default="1" w:styleId="TableNormal">
@@ -1283,6 +1311,37 @@
       <w:smallCaps/>
       <w:color w:val="2F5496" w:themeColor="accent1" w:themeShade="BF"/>
       <w:spacing w:val="5"/>
+    </w:rPr>
+  </w:style>
+  <w:style w:type="paragraph" w:styleId="HTMLPreformatted">
+    <w:name w:val="HTML Preformatted"/>
+    <w:basedOn w:val="Normal"/>
+    <w:link w:val="HTMLPreformattedChar"/>
+    <w:uiPriority w:val="99"/>
+    <w:semiHidden/>
+    <w:unhideWhenUsed/>
+    <w:rsid w:val="00C1298B"/>
+    <w:pPr>
+      <w:spacing w:after="0" w:line="240" w:lineRule="auto"/>
+    </w:pPr>
+    <w:rPr>
+      <w:rFonts w:ascii="Consolas" w:hAnsi="Consolas"/>
+      <w:sz w:val="20"/>
+      <w:szCs w:val="20"/>
+    </w:rPr>
+  </w:style>
+  <w:style w:type="character" w:customStyle="1" w:styleId="HTMLPreformattedChar">
+    <w:name w:val="HTML Preformatted Char"/>
+    <w:basedOn w:val="DefaultParagraphFont"/>
+    <w:link w:val="HTMLPreformatted"/>
+    <w:uiPriority w:val="99"/>
+    <w:semiHidden/>
+    <w:rsid w:val="00C1298B"/>
+    <w:rPr>
+      <w:rFonts w:ascii="Consolas" w:hAnsi="Consolas"/>
+      <w:sz w:val="20"/>
+      <w:szCs w:val="20"/>
+      <w:lang w:val="en-US"/>
     </w:rPr>
   </w:style>
 </w:styles>

</xml_diff>